<commit_message>
feat: add strategic comparison section with Moka POS per-outlet pricing in proposal app and docx
</commit_message>
<xml_diff>
--- a/Penawaran_Pengembangan_Ekosistem_Aplikasi_Kopi_Jodi.docx
+++ b/Penawaran_Pengembangan_Ekosistem_Aplikasi_Kopi_Jodi.docx
@@ -3101,8 +3101,6 @@
     <w:tbl>
       <w:tblPr>
         <w:tblW w:type="auto" w:w="0"/>
-        <w:jc w:val="center"/>
-        <w:tblLayout w:type="fixed"/>
         <w:tblLook w:firstColumn="1" w:firstRow="1" w:lastColumn="0" w:lastRow="0" w:noHBand="0" w:noVBand="1" w:val="04A0"/>
       </w:tblPr>
       <w:tblGrid>
@@ -3111,12 +3109,351 @@
         <w:gridCol w:w="3010"/>
       </w:tblGrid>
       <w:tr>
+        <w:tc>
+          <w:tcPr>
+            <w:tcW w:type="dxa" w:w="3010"/>
+          </w:tcPr>
+          <w:p>
+            <w:r>
+              <w:t>Parameter</w:t>
+            </w:r>
+          </w:p>
+        </w:tc>
+        <w:tc>
+          <w:tcPr>
+            <w:tcW w:type="dxa" w:w="3010"/>
+          </w:tcPr>
+          <w:p>
+            <w:r>
+              <w:t>Opsi 1: Beli Putus (Turnkey)</w:t>
+            </w:r>
+          </w:p>
+        </w:tc>
+        <w:tc>
+          <w:tcPr>
+            <w:tcW w:type="dxa" w:w="3010"/>
+          </w:tcPr>
+          <w:p>
+            <w:r>
+              <w:t>Opsi 2: Bulanan (Dedicated Programmer)</w:t>
+            </w:r>
+          </w:p>
+        </w:tc>
+      </w:tr>
+      <w:tr>
+        <w:tc>
+          <w:tcPr>
+            <w:tcW w:type="dxa" w:w="3010"/>
+          </w:tcPr>
+          <w:p>
+            <w:r>
+              <w:t>Beban Cashflow</w:t>
+            </w:r>
+          </w:p>
+        </w:tc>
+        <w:tc>
+          <w:tcPr>
+            <w:tcW w:type="dxa" w:w="3010"/>
+          </w:tcPr>
+          <w:p>
+            <w:r>
+              <w:t>Pengeluaran modal per termin proyek</w:t>
+            </w:r>
+          </w:p>
+        </w:tc>
+        <w:tc>
+          <w:tcPr>
+            <w:tcW w:type="dxa" w:w="3010"/>
+          </w:tcPr>
+          <w:p>
+            <w:r>
+              <w:t>Sangat Ringan (Rp 5 Juta/bln flat)</w:t>
+            </w:r>
+          </w:p>
+        </w:tc>
+      </w:tr>
+      <w:tr>
+        <w:tc>
+          <w:tcPr>
+            <w:tcW w:type="dxa" w:w="3010"/>
+          </w:tcPr>
+          <w:p>
+            <w:r>
+              <w:t>Masa Komitmen</w:t>
+            </w:r>
+          </w:p>
+        </w:tc>
+        <w:tc>
+          <w:tcPr>
+            <w:tcW w:type="dxa" w:w="3010"/>
+          </w:tcPr>
+          <w:p>
+            <w:r>
+              <w:t>Selesai per milestone fase (~3 - 6 bulan)</w:t>
+            </w:r>
+          </w:p>
+        </w:tc>
+        <w:tc>
+          <w:tcPr>
+            <w:tcW w:type="dxa" w:w="3010"/>
+          </w:tcPr>
+          <w:p>
+            <w:r>
+              <w:t>Minimal 5 Tahun (Kerjasama Jangka Panjang)</w:t>
+            </w:r>
+          </w:p>
+        </w:tc>
+      </w:tr>
+      <w:tr>
+        <w:tc>
+          <w:tcPr>
+            <w:tcW w:type="dxa" w:w="3010"/>
+          </w:tcPr>
+          <w:p>
+            <w:r>
+              <w:t>Maintenance &amp; Update</w:t>
+            </w:r>
+          </w:p>
+        </w:tc>
+        <w:tc>
+          <w:tcPr>
+            <w:tcW w:type="dxa" w:w="3010"/>
+          </w:tcPr>
+          <w:p>
+            <w:r>
+              <w:t>Garansi 3 - 6 bulan (setelahnya kontrak terpisah)</w:t>
+            </w:r>
+          </w:p>
+        </w:tc>
+        <w:tc>
+          <w:tcPr>
+            <w:tcW w:type="dxa" w:w="3010"/>
+          </w:tcPr>
+          <w:p>
+            <w:r>
+              <w:t>Gratis &amp; Standby selama 5 Tahun oleh genossys</w:t>
+            </w:r>
+          </w:p>
+        </w:tc>
+      </w:tr>
+      <w:tr>
+        <w:tc>
+          <w:tcPr>
+            <w:tcW w:type="dxa" w:w="3010"/>
+          </w:tcPr>
+          <w:p>
+            <w:r>
+              <w:t>Fleksibilitas Fitur</w:t>
+            </w:r>
+          </w:p>
+        </w:tc>
+        <w:tc>
+          <w:tcPr>
+            <w:tcW w:type="dxa" w:w="3010"/>
+          </w:tcPr>
+          <w:p>
+            <w:r>
+              <w:t>Terkunci sesuai scope dokumen spesifikasi awal</w:t>
+            </w:r>
+          </w:p>
+        </w:tc>
+        <w:tc>
+          <w:tcPr>
+            <w:tcW w:type="dxa" w:w="3010"/>
+          </w:tcPr>
+          <w:p>
+            <w:r>
+              <w:t>100% Bebas Tambah Fitur Apapun Kapan Saja (tanpa biaya ekstra per request)</w:t>
+            </w:r>
+          </w:p>
+        </w:tc>
+      </w:tr>
+      <w:tr>
+        <w:tc>
+          <w:tcPr>
+            <w:tcW w:type="dxa" w:w="3010"/>
+          </w:tcPr>
+          <w:p>
+            <w:r>
+              <w:t>Rekomendasi</w:t>
+            </w:r>
+          </w:p>
+        </w:tc>
+        <w:tc>
+          <w:tcPr>
+            <w:tcW w:type="dxa" w:w="3010"/>
+          </w:tcPr>
+          <w:p>
+            <w:r>
+              <w:t>Sangat Tepat jika Kopi Jodi memiliki modal awal &amp; ingin proyek selesai dalam target waktu.</w:t>
+            </w:r>
+          </w:p>
+        </w:tc>
+        <w:tc>
+          <w:tcPr>
+            <w:tcW w:type="dxa" w:w="3010"/>
+          </w:tcPr>
+          <w:p>
+            <w:r>
+              <w:t>Sangat Tepat jika Kopi Jodi ingin inovasi bebas tanpa batas &amp; cashflow bulanan ringan.</w:t>
+            </w:r>
+          </w:p>
+        </w:tc>
+      </w:tr>
+    </w:tbl>
+    <w:p>
+      <w:pPr>
+        <w:keepNext/>
+        <w:spacing w:before="280" w:after="100"/>
+        <w:pBdr>
+          <w:bottom w:val="single" w:sz="10" w:space="3" w:color="C27835"/>
+        </w:pBdr>
+      </w:pPr>
+      <w:r>
+        <w:rPr>
+          <w:rFonts w:ascii="Segoe UI" w:hAnsi="Segoe UI"/>
+          <w:b/>
+          <w:color w:val="2C1810"/>
+          <w:sz w:val="28"/>
+        </w:rPr>
+        <w:t>4. Komparasi Strategis: Mengapa Ekosistem Kopi Jodi Jauh Lebih Unggul &amp; Menguntungkan Dibanding Sewa Moka POS per Outlet?</w:t>
+      </w:r>
+    </w:p>
+    <w:p>
+      <w:pPr>
+        <w:spacing w:before="0" w:after="60" w:line="276" w:lineRule="auto"/>
+      </w:pPr>
+      <w:r>
+        <w:rPr>
+          <w:rFonts w:ascii="Segoe UI" w:hAnsi="Segoe UI"/>
+          <w:color w:val="374151"/>
+          <w:sz w:val="19"/>
+        </w:rPr>
+        <w:t>Banyak jaringan kafe pemula terjebak menyewa POS retail umum seperti Moka POS yang memungut biaya per outlet / per kasir. Untuk kafe multi-outlet yang agresif berekspansi, model sewa per outlet memiliki kelemahan finansial dan operasional yang fatal:</w:t>
+      </w:r>
+    </w:p>
+    <w:tbl>
+      <w:tblPr>
+        <w:tblW w:type="auto" w:w="0"/>
+        <w:jc w:val="center"/>
+        <w:tblLayout w:type="fixed"/>
+        <w:tblLook w:firstColumn="1" w:firstRow="1" w:lastColumn="0" w:lastRow="0" w:noHBand="0" w:noVBand="1" w:val="04A0"/>
+      </w:tblPr>
+      <w:tblGrid>
+        <w:gridCol w:w="2257"/>
+        <w:gridCol w:w="2257"/>
+        <w:gridCol w:w="2257"/>
+        <w:gridCol w:w="2257"/>
+      </w:tblGrid>
+      <w:tr>
         <w:trPr>
           <w:tblHeader/>
         </w:trPr>
         <w:tc>
           <w:tcPr>
+            <w:tcW w:type="dxa" w:w="1728"/>
+            <w:vAlign w:val="center"/>
+            <w:shd w:fill="2C1810"/>
+            <w:tcMar>
+              <w:top w:w="100" w:type="dxa"/>
+              <w:bottom w:w="100" w:type="dxa"/>
+              <w:left w:w="120" w:type="dxa"/>
+              <w:right w:w="120" w:type="dxa"/>
+            </w:tcMar>
+            <w:tcBorders>
+              <w:top w:val="single" w:sz="6" w:space="0" w:color="2C1810"/>
+              <w:left w:val="none"/>
+              <w:bottom w:val="single" w:sz="6" w:space="0" w:color="C27835"/>
+              <w:right w:val="none"/>
+            </w:tcBorders>
+          </w:tcPr>
+          <w:p>
+            <w:pPr>
+              <w:spacing w:before="20" w:after="20"/>
+              <w:jc w:val="center"/>
+            </w:pPr>
+            <w:r>
+              <w:rPr>
+                <w:rFonts w:ascii="Segoe UI" w:hAnsi="Segoe UI"/>
+                <w:b/>
+                <w:color w:val="FFFFFF"/>
+                <w:sz w:val="18"/>
+              </w:rPr>
+              <w:t>Jumlah Outlet</w:t>
+            </w:r>
+          </w:p>
+        </w:tc>
+        <w:tc>
+          <w:tcPr>
+            <w:tcW w:type="dxa" w:w="2592"/>
+            <w:vAlign w:val="center"/>
+            <w:shd w:fill="2C1810"/>
+            <w:tcMar>
+              <w:top w:w="100" w:type="dxa"/>
+              <w:bottom w:w="100" w:type="dxa"/>
+              <w:left w:w="120" w:type="dxa"/>
+              <w:right w:w="120" w:type="dxa"/>
+            </w:tcMar>
+            <w:tcBorders>
+              <w:top w:val="single" w:sz="6" w:space="0" w:color="2C1810"/>
+              <w:left w:val="none"/>
+              <w:bottom w:val="single" w:sz="6" w:space="0" w:color="C27835"/>
+              <w:right w:val="none"/>
+            </w:tcBorders>
+          </w:tcPr>
+          <w:p>
+            <w:pPr>
+              <w:spacing w:before="20" w:after="20"/>
+              <w:jc w:val="right"/>
+            </w:pPr>
+            <w:r>
+              <w:rPr>
+                <w:rFonts w:ascii="Segoe UI" w:hAnsi="Segoe UI"/>
+                <w:b/>
+                <w:color w:val="FFFFFF"/>
+                <w:sz w:val="18"/>
+              </w:rPr>
+              <w:t>Sewa Moka POS / Bln (~Rp 499rb/bln)</w:t>
+            </w:r>
+          </w:p>
+        </w:tc>
+        <w:tc>
+          <w:tcPr>
             <w:tcW w:type="dxa" w:w="2448"/>
+            <w:vAlign w:val="center"/>
+            <w:shd w:fill="2C1810"/>
+            <w:tcMar>
+              <w:top w:w="100" w:type="dxa"/>
+              <w:bottom w:w="100" w:type="dxa"/>
+              <w:left w:w="120" w:type="dxa"/>
+              <w:right w:w="120" w:type="dxa"/>
+            </w:tcMar>
+            <w:tcBorders>
+              <w:top w:val="single" w:sz="6" w:space="0" w:color="2C1810"/>
+              <w:left w:val="none"/>
+              <w:bottom w:val="single" w:sz="6" w:space="0" w:color="C27835"/>
+              <w:right w:val="none"/>
+            </w:tcBorders>
+          </w:tcPr>
+          <w:p>
+            <w:pPr>
+              <w:spacing w:before="20" w:after="20"/>
+              <w:jc w:val="right"/>
+            </w:pPr>
+            <w:r>
+              <w:rPr>
+                <w:rFonts w:ascii="Segoe UI" w:hAnsi="Segoe UI"/>
+                <w:b/>
+                <w:color w:val="FFFFFF"/>
+                <w:sz w:val="18"/>
+              </w:rPr>
+              <w:t>Total Sewa Moka (5 Tahun)</w:t>
+            </w:r>
+          </w:p>
+        </w:tc>
+        <w:tc>
+          <w:tcPr>
+            <w:tcW w:type="dxa" w:w="2261"/>
             <w:vAlign w:val="center"/>
             <w:shd w:fill="2C1810"/>
             <w:tcMar>
@@ -3144,13 +3481,587 @@
                 <w:color w:val="FFFFFF"/>
                 <w:sz w:val="18"/>
               </w:rPr>
-              <w:t>Parameter</w:t>
+              <w:t>Ekosistem Kopi Jodi (genossys)</w:t>
+            </w:r>
+          </w:p>
+        </w:tc>
+      </w:tr>
+      <w:tr>
+        <w:tc>
+          <w:tcPr>
+            <w:tcW w:type="dxa" w:w="1728"/>
+            <w:vAlign w:val="center"/>
+            <w:shd w:fill="FBF9F5"/>
+            <w:tcMar>
+              <w:top w:w="90" w:type="dxa"/>
+              <w:bottom w:w="90" w:type="dxa"/>
+              <w:left w:w="120" w:type="dxa"/>
+              <w:right w:w="120" w:type="dxa"/>
+            </w:tcMar>
+            <w:tcBorders>
+              <w:top w:val="single" w:sz="4" w:space="0" w:color="E5E0D8"/>
+              <w:left w:val="none"/>
+              <w:bottom w:val="single" w:sz="4" w:space="0" w:color="E5E0D8"/>
+              <w:right w:val="none"/>
+            </w:tcBorders>
+          </w:tcPr>
+          <w:p>
+            <w:pPr>
+              <w:spacing w:before="20" w:after="20" w:line="276" w:lineRule="auto"/>
+              <w:jc w:val="center"/>
+            </w:pPr>
+            <w:r>
+              <w:rPr>
+                <w:rFonts w:ascii="Segoe UI" w:hAnsi="Segoe UI"/>
+                <w:color w:val="374151"/>
+                <w:sz w:val="18"/>
+              </w:rPr>
+              <w:t>3 Outlet</w:t>
             </w:r>
           </w:p>
         </w:tc>
         <w:tc>
           <w:tcPr>
-            <w:tcW w:type="dxa" w:w="3312"/>
+            <w:tcW w:type="dxa" w:w="2592"/>
+            <w:vAlign w:val="center"/>
+            <w:shd w:fill="FBF9F5"/>
+            <w:tcMar>
+              <w:top w:w="90" w:type="dxa"/>
+              <w:bottom w:w="90" w:type="dxa"/>
+              <w:left w:w="120" w:type="dxa"/>
+              <w:right w:w="120" w:type="dxa"/>
+            </w:tcMar>
+            <w:tcBorders>
+              <w:top w:val="single" w:sz="4" w:space="0" w:color="E5E0D8"/>
+              <w:left w:val="none"/>
+              <w:bottom w:val="single" w:sz="4" w:space="0" w:color="E5E0D8"/>
+              <w:right w:val="none"/>
+            </w:tcBorders>
+          </w:tcPr>
+          <w:p>
+            <w:pPr>
+              <w:spacing w:before="20" w:after="20" w:line="276" w:lineRule="auto"/>
+              <w:jc w:val="right"/>
+            </w:pPr>
+            <w:r>
+              <w:rPr>
+                <w:rFonts w:ascii="Segoe UI" w:hAnsi="Segoe UI"/>
+                <w:color w:val="374151"/>
+                <w:sz w:val="18"/>
+              </w:rPr>
+              <w:t>Rp 1.497.000 / bln</w:t>
+            </w:r>
+          </w:p>
+        </w:tc>
+        <w:tc>
+          <w:tcPr>
+            <w:tcW w:type="dxa" w:w="2448"/>
+            <w:vAlign w:val="center"/>
+            <w:shd w:fill="FBF9F5"/>
+            <w:tcMar>
+              <w:top w:w="90" w:type="dxa"/>
+              <w:bottom w:w="90" w:type="dxa"/>
+              <w:left w:w="120" w:type="dxa"/>
+              <w:right w:w="120" w:type="dxa"/>
+            </w:tcMar>
+            <w:tcBorders>
+              <w:top w:val="single" w:sz="4" w:space="0" w:color="E5E0D8"/>
+              <w:left w:val="none"/>
+              <w:bottom w:val="single" w:sz="4" w:space="0" w:color="E5E0D8"/>
+              <w:right w:val="none"/>
+            </w:tcBorders>
+          </w:tcPr>
+          <w:p>
+            <w:pPr>
+              <w:spacing w:before="20" w:after="20" w:line="276" w:lineRule="auto"/>
+              <w:jc w:val="right"/>
+            </w:pPr>
+            <w:r>
+              <w:rPr>
+                <w:rFonts w:ascii="Segoe UI" w:hAnsi="Segoe UI"/>
+                <w:color w:val="374151"/>
+                <w:sz w:val="18"/>
+              </w:rPr>
+              <w:t>Rp 89.820.000,-</w:t>
+            </w:r>
+          </w:p>
+        </w:tc>
+        <w:tc>
+          <w:tcPr>
+            <w:tcW w:type="dxa" w:w="2261"/>
+            <w:vAlign w:val="center"/>
+            <w:shd w:fill="FBF9F5"/>
+            <w:tcMar>
+              <w:top w:w="90" w:type="dxa"/>
+              <w:bottom w:w="90" w:type="dxa"/>
+              <w:left w:w="120" w:type="dxa"/>
+              <w:right w:w="120" w:type="dxa"/>
+            </w:tcMar>
+            <w:tcBorders>
+              <w:top w:val="single" w:sz="4" w:space="0" w:color="E5E0D8"/>
+              <w:left w:val="none"/>
+              <w:bottom w:val="single" w:sz="4" w:space="0" w:color="E5E0D8"/>
+              <w:right w:val="none"/>
+            </w:tcBorders>
+          </w:tcPr>
+          <w:p>
+            <w:pPr>
+              <w:spacing w:before="20" w:after="20" w:line="276" w:lineRule="auto"/>
+              <w:jc w:val="left"/>
+            </w:pPr>
+            <w:r>
+              <w:rPr>
+                <w:rFonts w:ascii="Segoe UI" w:hAnsi="Segoe UI"/>
+                <w:color w:val="374151"/>
+                <w:sz w:val="18"/>
+              </w:rPr>
+              <w:t>Rp 5 Juta/bln flat (8 Apps + Hak Milik)</w:t>
+            </w:r>
+          </w:p>
+        </w:tc>
+      </w:tr>
+      <w:tr>
+        <w:tc>
+          <w:tcPr>
+            <w:tcW w:type="dxa" w:w="1728"/>
+            <w:vAlign w:val="center"/>
+            <w:shd w:fill="FFFFFF"/>
+            <w:tcMar>
+              <w:top w:w="90" w:type="dxa"/>
+              <w:bottom w:w="90" w:type="dxa"/>
+              <w:left w:w="120" w:type="dxa"/>
+              <w:right w:w="120" w:type="dxa"/>
+            </w:tcMar>
+            <w:tcBorders>
+              <w:top w:val="single" w:sz="4" w:space="0" w:color="E5E0D8"/>
+              <w:left w:val="none"/>
+              <w:bottom w:val="single" w:sz="4" w:space="0" w:color="E5E0D8"/>
+              <w:right w:val="none"/>
+            </w:tcBorders>
+          </w:tcPr>
+          <w:p>
+            <w:pPr>
+              <w:spacing w:before="20" w:after="20" w:line="276" w:lineRule="auto"/>
+              <w:jc w:val="center"/>
+            </w:pPr>
+            <w:r>
+              <w:rPr>
+                <w:rFonts w:ascii="Segoe UI" w:hAnsi="Segoe UI"/>
+                <w:color w:val="374151"/>
+                <w:sz w:val="18"/>
+              </w:rPr>
+              <w:t>5 Outlet</w:t>
+            </w:r>
+          </w:p>
+        </w:tc>
+        <w:tc>
+          <w:tcPr>
+            <w:tcW w:type="dxa" w:w="2592"/>
+            <w:vAlign w:val="center"/>
+            <w:shd w:fill="FFFFFF"/>
+            <w:tcMar>
+              <w:top w:w="90" w:type="dxa"/>
+              <w:bottom w:w="90" w:type="dxa"/>
+              <w:left w:w="120" w:type="dxa"/>
+              <w:right w:w="120" w:type="dxa"/>
+            </w:tcMar>
+            <w:tcBorders>
+              <w:top w:val="single" w:sz="4" w:space="0" w:color="E5E0D8"/>
+              <w:left w:val="none"/>
+              <w:bottom w:val="single" w:sz="4" w:space="0" w:color="E5E0D8"/>
+              <w:right w:val="none"/>
+            </w:tcBorders>
+          </w:tcPr>
+          <w:p>
+            <w:pPr>
+              <w:spacing w:before="20" w:after="20" w:line="276" w:lineRule="auto"/>
+              <w:jc w:val="right"/>
+            </w:pPr>
+            <w:r>
+              <w:rPr>
+                <w:rFonts w:ascii="Segoe UI" w:hAnsi="Segoe UI"/>
+                <w:color w:val="374151"/>
+                <w:sz w:val="18"/>
+              </w:rPr>
+              <w:t>Rp 2.495.000 / bln</w:t>
+            </w:r>
+          </w:p>
+        </w:tc>
+        <w:tc>
+          <w:tcPr>
+            <w:tcW w:type="dxa" w:w="2448"/>
+            <w:vAlign w:val="center"/>
+            <w:shd w:fill="FFFFFF"/>
+            <w:tcMar>
+              <w:top w:w="90" w:type="dxa"/>
+              <w:bottom w:w="90" w:type="dxa"/>
+              <w:left w:w="120" w:type="dxa"/>
+              <w:right w:w="120" w:type="dxa"/>
+            </w:tcMar>
+            <w:tcBorders>
+              <w:top w:val="single" w:sz="4" w:space="0" w:color="E5E0D8"/>
+              <w:left w:val="none"/>
+              <w:bottom w:val="single" w:sz="4" w:space="0" w:color="E5E0D8"/>
+              <w:right w:val="none"/>
+            </w:tcBorders>
+          </w:tcPr>
+          <w:p>
+            <w:pPr>
+              <w:spacing w:before="20" w:after="20" w:line="276" w:lineRule="auto"/>
+              <w:jc w:val="right"/>
+            </w:pPr>
+            <w:r>
+              <w:rPr>
+                <w:rFonts w:ascii="Segoe UI" w:hAnsi="Segoe UI"/>
+                <w:color w:val="374151"/>
+                <w:sz w:val="18"/>
+              </w:rPr>
+              <w:t>Rp 149.700.000,-</w:t>
+            </w:r>
+          </w:p>
+        </w:tc>
+        <w:tc>
+          <w:tcPr>
+            <w:tcW w:type="dxa" w:w="2261"/>
+            <w:vAlign w:val="center"/>
+            <w:shd w:fill="FFFFFF"/>
+            <w:tcMar>
+              <w:top w:w="90" w:type="dxa"/>
+              <w:bottom w:w="90" w:type="dxa"/>
+              <w:left w:w="120" w:type="dxa"/>
+              <w:right w:w="120" w:type="dxa"/>
+            </w:tcMar>
+            <w:tcBorders>
+              <w:top w:val="single" w:sz="4" w:space="0" w:color="E5E0D8"/>
+              <w:left w:val="none"/>
+              <w:bottom w:val="single" w:sz="4" w:space="0" w:color="E5E0D8"/>
+              <w:right w:val="none"/>
+            </w:tcBorders>
+          </w:tcPr>
+          <w:p>
+            <w:pPr>
+              <w:spacing w:before="20" w:after="20" w:line="276" w:lineRule="auto"/>
+              <w:jc w:val="left"/>
+            </w:pPr>
+            <w:r>
+              <w:rPr>
+                <w:rFonts w:ascii="Segoe UI" w:hAnsi="Segoe UI"/>
+                <w:color w:val="374151"/>
+                <w:sz w:val="18"/>
+              </w:rPr>
+              <w:t>Rp 5 Juta/bln flat (Hemat komisi ojol)</w:t>
+            </w:r>
+          </w:p>
+        </w:tc>
+      </w:tr>
+      <w:tr>
+        <w:tc>
+          <w:tcPr>
+            <w:tcW w:type="dxa" w:w="1728"/>
+            <w:vAlign w:val="center"/>
+            <w:shd w:fill="FBF9F5"/>
+            <w:tcMar>
+              <w:top w:w="90" w:type="dxa"/>
+              <w:bottom w:w="90" w:type="dxa"/>
+              <w:left w:w="120" w:type="dxa"/>
+              <w:right w:w="120" w:type="dxa"/>
+            </w:tcMar>
+            <w:tcBorders>
+              <w:top w:val="single" w:sz="4" w:space="0" w:color="E5E0D8"/>
+              <w:left w:val="none"/>
+              <w:bottom w:val="single" w:sz="4" w:space="0" w:color="E5E0D8"/>
+              <w:right w:val="none"/>
+            </w:tcBorders>
+          </w:tcPr>
+          <w:p>
+            <w:pPr>
+              <w:spacing w:before="20" w:after="20" w:line="276" w:lineRule="auto"/>
+              <w:jc w:val="center"/>
+            </w:pPr>
+            <w:r>
+              <w:rPr>
+                <w:rFonts w:ascii="Segoe UI" w:hAnsi="Segoe UI"/>
+                <w:color w:val="374151"/>
+                <w:sz w:val="18"/>
+              </w:rPr>
+              <w:t>10 Outlet</w:t>
+            </w:r>
+          </w:p>
+        </w:tc>
+        <w:tc>
+          <w:tcPr>
+            <w:tcW w:type="dxa" w:w="2592"/>
+            <w:vAlign w:val="center"/>
+            <w:shd w:fill="FBF9F5"/>
+            <w:tcMar>
+              <w:top w:w="90" w:type="dxa"/>
+              <w:bottom w:w="90" w:type="dxa"/>
+              <w:left w:w="120" w:type="dxa"/>
+              <w:right w:w="120" w:type="dxa"/>
+            </w:tcMar>
+            <w:tcBorders>
+              <w:top w:val="single" w:sz="4" w:space="0" w:color="E5E0D8"/>
+              <w:left w:val="none"/>
+              <w:bottom w:val="single" w:sz="4" w:space="0" w:color="E5E0D8"/>
+              <w:right w:val="none"/>
+            </w:tcBorders>
+          </w:tcPr>
+          <w:p>
+            <w:pPr>
+              <w:spacing w:before="20" w:after="20" w:line="276" w:lineRule="auto"/>
+              <w:jc w:val="right"/>
+            </w:pPr>
+            <w:r>
+              <w:rPr>
+                <w:rFonts w:ascii="Segoe UI" w:hAnsi="Segoe UI"/>
+                <w:color w:val="374151"/>
+                <w:sz w:val="18"/>
+              </w:rPr>
+              <w:t>Rp 4.990.000 / bln</w:t>
+            </w:r>
+          </w:p>
+        </w:tc>
+        <w:tc>
+          <w:tcPr>
+            <w:tcW w:type="dxa" w:w="2448"/>
+            <w:vAlign w:val="center"/>
+            <w:shd w:fill="FBF9F5"/>
+            <w:tcMar>
+              <w:top w:w="90" w:type="dxa"/>
+              <w:bottom w:w="90" w:type="dxa"/>
+              <w:left w:w="120" w:type="dxa"/>
+              <w:right w:w="120" w:type="dxa"/>
+            </w:tcMar>
+            <w:tcBorders>
+              <w:top w:val="single" w:sz="4" w:space="0" w:color="E5E0D8"/>
+              <w:left w:val="none"/>
+              <w:bottom w:val="single" w:sz="4" w:space="0" w:color="E5E0D8"/>
+              <w:right w:val="none"/>
+            </w:tcBorders>
+          </w:tcPr>
+          <w:p>
+            <w:pPr>
+              <w:spacing w:before="20" w:after="20" w:line="276" w:lineRule="auto"/>
+              <w:jc w:val="right"/>
+            </w:pPr>
+            <w:r>
+              <w:rPr>
+                <w:rFonts w:ascii="Segoe UI" w:hAnsi="Segoe UI"/>
+                <w:color w:val="374151"/>
+                <w:sz w:val="18"/>
+              </w:rPr>
+              <w:t>Rp 299.400.000,-</w:t>
+            </w:r>
+          </w:p>
+        </w:tc>
+        <w:tc>
+          <w:tcPr>
+            <w:tcW w:type="dxa" w:w="2261"/>
+            <w:vAlign w:val="center"/>
+            <w:shd w:fill="FBF9F5"/>
+            <w:tcMar>
+              <w:top w:w="90" w:type="dxa"/>
+              <w:bottom w:w="90" w:type="dxa"/>
+              <w:left w:w="120" w:type="dxa"/>
+              <w:right w:w="120" w:type="dxa"/>
+            </w:tcMar>
+            <w:tcBorders>
+              <w:top w:val="single" w:sz="4" w:space="0" w:color="E5E0D8"/>
+              <w:left w:val="none"/>
+              <w:bottom w:val="single" w:sz="4" w:space="0" w:color="E5E0D8"/>
+              <w:right w:val="none"/>
+            </w:tcBorders>
+          </w:tcPr>
+          <w:p>
+            <w:pPr>
+              <w:spacing w:before="20" w:after="20" w:line="276" w:lineRule="auto"/>
+              <w:jc w:val="left"/>
+            </w:pPr>
+            <w:r>
+              <w:rPr>
+                <w:rFonts w:ascii="Segoe UI" w:hAnsi="Segoe UI"/>
+                <w:color w:val="374151"/>
+                <w:sz w:val="18"/>
+              </w:rPr>
+              <w:t>BIAYA SAMA, TAPI DAPAT DEDICATED DEV 5 TAHUN + BEBAS TAMBAH FITUR!</w:t>
+            </w:r>
+          </w:p>
+        </w:tc>
+      </w:tr>
+      <w:tr>
+        <w:tc>
+          <w:tcPr>
+            <w:tcW w:type="dxa" w:w="1728"/>
+            <w:vAlign w:val="center"/>
+            <w:shd w:fill="FFFFFF"/>
+            <w:tcMar>
+              <w:top w:w="90" w:type="dxa"/>
+              <w:bottom w:w="90" w:type="dxa"/>
+              <w:left w:w="120" w:type="dxa"/>
+              <w:right w:w="120" w:type="dxa"/>
+            </w:tcMar>
+            <w:tcBorders>
+              <w:top w:val="single" w:sz="4" w:space="0" w:color="E5E0D8"/>
+              <w:left w:val="none"/>
+              <w:bottom w:val="single" w:sz="4" w:space="0" w:color="E5E0D8"/>
+              <w:right w:val="none"/>
+            </w:tcBorders>
+          </w:tcPr>
+          <w:p>
+            <w:pPr>
+              <w:spacing w:before="20" w:after="20" w:line="276" w:lineRule="auto"/>
+              <w:jc w:val="center"/>
+            </w:pPr>
+            <w:r>
+              <w:rPr>
+                <w:rFonts w:ascii="Segoe UI" w:hAnsi="Segoe UI"/>
+                <w:color w:val="374151"/>
+                <w:sz w:val="18"/>
+              </w:rPr>
+              <w:t>20 Outlet</w:t>
+            </w:r>
+          </w:p>
+        </w:tc>
+        <w:tc>
+          <w:tcPr>
+            <w:tcW w:type="dxa" w:w="2592"/>
+            <w:vAlign w:val="center"/>
+            <w:shd w:fill="FFFFFF"/>
+            <w:tcMar>
+              <w:top w:w="90" w:type="dxa"/>
+              <w:bottom w:w="90" w:type="dxa"/>
+              <w:left w:w="120" w:type="dxa"/>
+              <w:right w:w="120" w:type="dxa"/>
+            </w:tcMar>
+            <w:tcBorders>
+              <w:top w:val="single" w:sz="4" w:space="0" w:color="E5E0D8"/>
+              <w:left w:val="none"/>
+              <w:bottom w:val="single" w:sz="4" w:space="0" w:color="E5E0D8"/>
+              <w:right w:val="none"/>
+            </w:tcBorders>
+          </w:tcPr>
+          <w:p>
+            <w:pPr>
+              <w:spacing w:before="20" w:after="20" w:line="276" w:lineRule="auto"/>
+              <w:jc w:val="right"/>
+            </w:pPr>
+            <w:r>
+              <w:rPr>
+                <w:rFonts w:ascii="Segoe UI" w:hAnsi="Segoe UI"/>
+                <w:color w:val="374151"/>
+                <w:sz w:val="18"/>
+              </w:rPr>
+              <w:t>Rp 9.980.000 / bln</w:t>
+            </w:r>
+          </w:p>
+        </w:tc>
+        <w:tc>
+          <w:tcPr>
+            <w:tcW w:type="dxa" w:w="2448"/>
+            <w:vAlign w:val="center"/>
+            <w:shd w:fill="FFFFFF"/>
+            <w:tcMar>
+              <w:top w:w="90" w:type="dxa"/>
+              <w:bottom w:w="90" w:type="dxa"/>
+              <w:left w:w="120" w:type="dxa"/>
+              <w:right w:w="120" w:type="dxa"/>
+            </w:tcMar>
+            <w:tcBorders>
+              <w:top w:val="single" w:sz="4" w:space="0" w:color="E5E0D8"/>
+              <w:left w:val="none"/>
+              <w:bottom w:val="single" w:sz="4" w:space="0" w:color="E5E0D8"/>
+              <w:right w:val="none"/>
+            </w:tcBorders>
+          </w:tcPr>
+          <w:p>
+            <w:pPr>
+              <w:spacing w:before="20" w:after="20" w:line="276" w:lineRule="auto"/>
+              <w:jc w:val="right"/>
+            </w:pPr>
+            <w:r>
+              <w:rPr>
+                <w:rFonts w:ascii="Segoe UI" w:hAnsi="Segoe UI"/>
+                <w:color w:val="374151"/>
+                <w:sz w:val="18"/>
+              </w:rPr>
+              <w:t>Rp 598.800.000,-</w:t>
+            </w:r>
+          </w:p>
+        </w:tc>
+        <w:tc>
+          <w:tcPr>
+            <w:tcW w:type="dxa" w:w="2261"/>
+            <w:vAlign w:val="center"/>
+            <w:shd w:fill="FFFFFF"/>
+            <w:tcMar>
+              <w:top w:w="90" w:type="dxa"/>
+              <w:bottom w:w="90" w:type="dxa"/>
+              <w:left w:w="120" w:type="dxa"/>
+              <w:right w:w="120" w:type="dxa"/>
+            </w:tcMar>
+            <w:tcBorders>
+              <w:top w:val="single" w:sz="4" w:space="0" w:color="E5E0D8"/>
+              <w:left w:val="none"/>
+              <w:bottom w:val="single" w:sz="4" w:space="0" w:color="E5E0D8"/>
+              <w:right w:val="none"/>
+            </w:tcBorders>
+          </w:tcPr>
+          <w:p>
+            <w:pPr>
+              <w:spacing w:before="20" w:after="20" w:line="276" w:lineRule="auto"/>
+              <w:jc w:val="left"/>
+            </w:pPr>
+            <w:r>
+              <w:rPr>
+                <w:rFonts w:ascii="Segoe UI" w:hAnsi="Segoe UI"/>
+                <w:color w:val="374151"/>
+                <w:sz w:val="18"/>
+              </w:rPr>
+              <w:t>KOPI JODI 50% LEBIH HEMAT (Hemat Rp 300 Juta!)</w:t>
+            </w:r>
+          </w:p>
+        </w:tc>
+      </w:tr>
+    </w:tbl>
+    <w:p>
+      <w:pPr>
+        <w:spacing w:after="80"/>
+      </w:pPr>
+    </w:p>
+    <w:p>
+      <w:pPr>
+        <w:keepNext/>
+        <w:spacing w:before="200" w:after="60"/>
+      </w:pPr>
+      <w:r>
+        <w:rPr>
+          <w:rFonts w:ascii="Segoe UI" w:hAnsi="Segoe UI"/>
+          <w:b/>
+          <w:color w:val="4A2E18"/>
+          <w:sz w:val="23"/>
+        </w:rPr>
+        <w:t>Perbandingan 10 Aspek Fundamental: Kopi Jodi vs Sewa Moka POS</w:t>
+      </w:r>
+    </w:p>
+    <w:tbl>
+      <w:tblPr>
+        <w:tblW w:type="auto" w:w="0"/>
+        <w:jc w:val="center"/>
+        <w:tblLayout w:type="fixed"/>
+        <w:tblLook w:firstColumn="1" w:firstRow="1" w:lastColumn="0" w:lastRow="0" w:noHBand="0" w:noVBand="1" w:val="04A0"/>
+      </w:tblPr>
+      <w:tblGrid>
+        <w:gridCol w:w="3010"/>
+        <w:gridCol w:w="3010"/>
+        <w:gridCol w:w="3010"/>
+      </w:tblGrid>
+      <w:tr>
+        <w:trPr>
+          <w:tblHeader/>
+        </w:trPr>
+        <w:tc>
+          <w:tcPr>
+            <w:tcW w:type="dxa" w:w="2592"/>
             <w:vAlign w:val="center"/>
             <w:shd w:fill="2C1810"/>
             <w:tcMar>
@@ -3178,7 +4089,41 @@
                 <w:color w:val="FFFFFF"/>
                 <w:sz w:val="18"/>
               </w:rPr>
-              <w:t>Opsi 1: Beli Putus (Turnkey)</w:t>
+              <w:t>Aspek Perbandingan</w:t>
+            </w:r>
+          </w:p>
+        </w:tc>
+        <w:tc>
+          <w:tcPr>
+            <w:tcW w:type="dxa" w:w="3168"/>
+            <w:vAlign w:val="center"/>
+            <w:shd w:fill="2C1810"/>
+            <w:tcMar>
+              <w:top w:w="100" w:type="dxa"/>
+              <w:bottom w:w="100" w:type="dxa"/>
+              <w:left w:w="120" w:type="dxa"/>
+              <w:right w:w="120" w:type="dxa"/>
+            </w:tcMar>
+            <w:tcBorders>
+              <w:top w:val="single" w:sz="6" w:space="0" w:color="2C1810"/>
+              <w:left w:val="none"/>
+              <w:bottom w:val="single" w:sz="6" w:space="0" w:color="C27835"/>
+              <w:right w:val="none"/>
+            </w:tcBorders>
+          </w:tcPr>
+          <w:p>
+            <w:pPr>
+              <w:spacing w:before="20" w:after="20"/>
+              <w:jc w:val="left"/>
+            </w:pPr>
+            <w:r>
+              <w:rPr>
+                <w:rFonts w:ascii="Segoe UI" w:hAnsi="Segoe UI"/>
+                <w:b/>
+                <w:color w:val="FFFFFF"/>
+                <w:sz w:val="18"/>
+              </w:rPr>
+              <w:t>Sewa Moka POS per Outlet</w:t>
             </w:r>
           </w:p>
         </w:tc>
@@ -3212,7 +4157,7 @@
                 <w:color w:val="FFFFFF"/>
                 <w:sz w:val="18"/>
               </w:rPr>
-              <w:t>Opsi 2: Bulanan (Dedicated Programmer)</w:t>
+              <w:t>Ekosistem Terintegrasi Kopi Jodi</w:t>
             </w:r>
           </w:p>
         </w:tc>
@@ -3220,7 +4165,7 @@
       <w:tr>
         <w:tc>
           <w:tcPr>
-            <w:tcW w:type="dxa" w:w="2448"/>
+            <w:tcW w:type="dxa" w:w="2592"/>
             <w:vAlign w:val="center"/>
             <w:shd w:fill="FBF9F5"/>
             <w:tcMar>
@@ -3247,13 +4192,13 @@
                 <w:color w:val="374151"/>
                 <w:sz w:val="18"/>
               </w:rPr>
-              <w:t>Beban Cashflow</w:t>
+              <w:t>1. Biaya Tambah Cabang</w:t>
             </w:r>
           </w:p>
         </w:tc>
         <w:tc>
           <w:tcPr>
-            <w:tcW w:type="dxa" w:w="3312"/>
+            <w:tcW w:type="dxa" w:w="3168"/>
             <w:vAlign w:val="center"/>
             <w:shd w:fill="FBF9F5"/>
             <w:tcMar>
@@ -3280,7 +4225,7 @@
                 <w:color w:val="374151"/>
                 <w:sz w:val="18"/>
               </w:rPr>
-              <w:t>Pengeluaran modal per termin proyek</w:t>
+              <w:t>Membengkak: Buka cabang baru wajib bayar lisensi sewa baru per outlet selamanya.</w:t>
             </w:r>
           </w:p>
         </w:tc>
@@ -3313,7 +4258,7 @@
                 <w:color w:val="374151"/>
                 <w:sz w:val="18"/>
               </w:rPr>
-              <w:t>Sangat Ringan (Rp 5 Juta/bln flat)</w:t>
+              <w:t>Biaya Flat Rp 0: Buka 5, 20, 100 cabang software Rp 0 per cabang tambahan.</w:t>
             </w:r>
           </w:p>
         </w:tc>
@@ -3321,7 +4266,7 @@
       <w:tr>
         <w:tc>
           <w:tcPr>
-            <w:tcW w:type="dxa" w:w="2448"/>
+            <w:tcW w:type="dxa" w:w="2592"/>
             <w:vAlign w:val="center"/>
             <w:shd w:fill="FFFFFF"/>
             <w:tcMar>
@@ -3348,13 +4293,13 @@
                 <w:color w:val="374151"/>
                 <w:sz w:val="18"/>
               </w:rPr>
-              <w:t>Masa Komitmen</w:t>
+              <w:t>2. Mobile App Pelanggan (PWA)</w:t>
             </w:r>
           </w:p>
         </w:tc>
         <w:tc>
           <w:tcPr>
-            <w:tcW w:type="dxa" w:w="3312"/>
+            <w:tcW w:type="dxa" w:w="3168"/>
             <w:vAlign w:val="center"/>
             <w:shd w:fill="FFFFFF"/>
             <w:tcMar>
@@ -3381,7 +4326,7 @@
                 <w:color w:val="374151"/>
                 <w:sz w:val="18"/>
               </w:rPr>
-              <w:t>Selesai per milestone fase (~3 - 6 bulan)</w:t>
+              <w:t>Tidak Ada: Pelanggan wajib antre kasir atau kafe kena potongan komisi ojol 20-30%.</w:t>
             </w:r>
           </w:p>
         </w:tc>
@@ -3414,7 +4359,7 @@
                 <w:color w:val="374151"/>
                 <w:sz w:val="18"/>
               </w:rPr>
-              <w:t>Minimal 5 Tahun (Kerjasama Jangka Panjang)</w:t>
+              <w:t>Tersedia Resmi (iOS/Android/PWA): Pelanggan pesan online tanpa antre, zero potongan komisi ojol!</w:t>
             </w:r>
           </w:p>
         </w:tc>
@@ -3422,7 +4367,7 @@
       <w:tr>
         <w:tc>
           <w:tcPr>
-            <w:tcW w:type="dxa" w:w="2448"/>
+            <w:tcW w:type="dxa" w:w="2592"/>
             <w:vAlign w:val="center"/>
             <w:shd w:fill="FBF9F5"/>
             <w:tcMar>
@@ -3449,13 +4394,13 @@
                 <w:color w:val="374151"/>
                 <w:sz w:val="18"/>
               </w:rPr>
-              <w:t>Maintenance &amp; Update</w:t>
+              <w:t>3. Koreksi HPP Otomatis (True-Up)</w:t>
             </w:r>
           </w:p>
         </w:tc>
         <w:tc>
           <w:tcPr>
-            <w:tcW w:type="dxa" w:w="3312"/>
+            <w:tcW w:type="dxa" w:w="3168"/>
             <w:vAlign w:val="center"/>
             <w:shd w:fill="FBF9F5"/>
             <w:tcMar>
@@ -3482,7 +4427,7 @@
                 <w:color w:val="374151"/>
                 <w:sz w:val="18"/>
               </w:rPr>
-              <w:t>Garansi 3 - 6 bulan (setelahnya kontrak terpisah)</w:t>
+              <w:t>Tidak Ada: HPP statis. Nota supplier terlambat membuat laporan laba rugi bias / laba semu.</w:t>
             </w:r>
           </w:p>
         </w:tc>
@@ -3515,7 +4460,7 @@
                 <w:color w:val="374151"/>
                 <w:sz w:val="18"/>
               </w:rPr>
-              <w:t>Gratis &amp; Standby selama 5 Tahun oleh genossys</w:t>
+              <w:t>Otomatis (BR-06): Saat nota diverifikasi Finance, HPP pesanan terjual direvisi otomatis. Laba 100% riil.</w:t>
             </w:r>
           </w:p>
         </w:tc>
@@ -3523,7 +4468,7 @@
       <w:tr>
         <w:tc>
           <w:tcPr>
-            <w:tcW w:type="dxa" w:w="2448"/>
+            <w:tcW w:type="dxa" w:w="2592"/>
             <w:vAlign w:val="center"/>
             <w:shd w:fill="FFFFFF"/>
             <w:tcMar>
@@ -3550,13 +4495,13 @@
                 <w:color w:val="374151"/>
                 <w:sz w:val="18"/>
               </w:rPr>
-              <w:t>Fleksibilitas Fitur</w:t>
+              <w:t>4. Potong Stok di KDS Dapur</w:t>
             </w:r>
           </w:p>
         </w:tc>
         <w:tc>
           <w:tcPr>
-            <w:tcW w:type="dxa" w:w="3312"/>
+            <w:tcW w:type="dxa" w:w="3168"/>
             <w:vAlign w:val="center"/>
             <w:shd w:fill="FFFFFF"/>
             <w:tcMar>
@@ -3583,7 +4528,7 @@
                 <w:color w:val="374151"/>
                 <w:sz w:val="18"/>
               </w:rPr>
-              <w:t>Terkunci sesuai scope dokumen spesifikasi awal</w:t>
+              <w:t>Di Kasir: Terpotong saat bayar di kasir, sering selisih jika batal di meja racik.</w:t>
             </w:r>
           </w:p>
         </w:tc>
@@ -3616,7 +4561,7 @@
                 <w:color w:val="374151"/>
                 <w:sz w:val="18"/>
               </w:rPr>
-              <w:t>100% Bebas Tambah Fitur Apapun Kapan Saja (tanpa biaya ekstra per request)</w:t>
+              <w:t>Di KDS Barista (BR-12): Stok bahan baku BOM terpotong presisi saat barista menyelesaikan tiket.</w:t>
             </w:r>
           </w:p>
         </w:tc>
@@ -3624,7 +4569,7 @@
       <w:tr>
         <w:tc>
           <w:tcPr>
-            <w:tcW w:type="dxa" w:w="2448"/>
+            <w:tcW w:type="dxa" w:w="2592"/>
             <w:vAlign w:val="center"/>
             <w:shd w:fill="FBF9F5"/>
             <w:tcMar>
@@ -3651,13 +4596,13 @@
                 <w:color w:val="374151"/>
                 <w:sz w:val="18"/>
               </w:rPr>
-              <w:t>Rekomendasi</w:t>
+              <w:t>5. Resep Olahan Batch Dapur</w:t>
             </w:r>
           </w:p>
         </w:tc>
         <w:tc>
           <w:tcPr>
-            <w:tcW w:type="dxa" w:w="3312"/>
+            <w:tcW w:type="dxa" w:w="3168"/>
             <w:vAlign w:val="center"/>
             <w:shd w:fill="FBF9F5"/>
             <w:tcMar>
@@ -3684,7 +4629,7 @@
                 <w:color w:val="374151"/>
                 <w:sz w:val="18"/>
               </w:rPr>
-              <w:t>Sangat Tepat jika Kopi Jodi memiliki modal awal &amp; ingin proyek selesai dalam target waktu.</w:t>
+              <w:t>Terbatas Bahan Mentah: Tidak mendukung resep olahan batch dapur sebelum buka.</w:t>
             </w:r>
           </w:p>
         </w:tc>
@@ -3717,7 +4662,512 @@
                 <w:color w:val="374151"/>
                 <w:sz w:val="18"/>
               </w:rPr>
-              <w:t>Sangat Tepat jika Kopi Jodi ingin inovasi bebas tanpa batas &amp; cashflow bulanan ringan.</w:t>
+              <w:t>Mendukung Penuh: Resep batch simple syrup aren 1.2L, cold brew 24h, topping jelly lengkap dengan yield &amp; HPP.</w:t>
+            </w:r>
+          </w:p>
+        </w:tc>
+      </w:tr>
+      <w:tr>
+        <w:tc>
+          <w:tcPr>
+            <w:tcW w:type="dxa" w:w="2592"/>
+            <w:vAlign w:val="center"/>
+            <w:shd w:fill="FFFFFF"/>
+            <w:tcMar>
+              <w:top w:w="90" w:type="dxa"/>
+              <w:bottom w:w="90" w:type="dxa"/>
+              <w:left w:w="120" w:type="dxa"/>
+              <w:right w:w="120" w:type="dxa"/>
+            </w:tcMar>
+            <w:tcBorders>
+              <w:top w:val="single" w:sz="4" w:space="0" w:color="E5E0D8"/>
+              <w:left w:val="none"/>
+              <w:bottom w:val="single" w:sz="4" w:space="0" w:color="E5E0D8"/>
+              <w:right w:val="none"/>
+            </w:tcBorders>
+          </w:tcPr>
+          <w:p>
+            <w:pPr>
+              <w:spacing w:before="20" w:after="20" w:line="276" w:lineRule="auto"/>
+              <w:jc w:val="left"/>
+            </w:pPr>
+            <w:r>
+              <w:rPr>
+                <w:rFonts w:ascii="Segoe UI" w:hAnsi="Segoe UI"/>
+                <w:color w:val="374151"/>
+                <w:sz w:val="18"/>
+              </w:rPr>
+              <w:t>6. Kontrol Kas Kecil (Petty Cash)</w:t>
+            </w:r>
+          </w:p>
+        </w:tc>
+        <w:tc>
+          <w:tcPr>
+            <w:tcW w:type="dxa" w:w="3168"/>
+            <w:vAlign w:val="center"/>
+            <w:shd w:fill="FFFFFF"/>
+            <w:tcMar>
+              <w:top w:w="90" w:type="dxa"/>
+              <w:bottom w:w="90" w:type="dxa"/>
+              <w:left w:w="120" w:type="dxa"/>
+              <w:right w:w="120" w:type="dxa"/>
+            </w:tcMar>
+            <w:tcBorders>
+              <w:top w:val="single" w:sz="4" w:space="0" w:color="E5E0D8"/>
+              <w:left w:val="none"/>
+              <w:bottom w:val="single" w:sz="4" w:space="0" w:color="E5E0D8"/>
+              <w:right w:val="none"/>
+            </w:tcBorders>
+          </w:tcPr>
+          <w:p>
+            <w:pPr>
+              <w:spacing w:before="20" w:after="20" w:line="276" w:lineRule="auto"/>
+              <w:jc w:val="left"/>
+            </w:pPr>
+            <w:r>
+              <w:rPr>
+                <w:rFonts w:ascii="Segoe UI" w:hAnsi="Segoe UI"/>
+                <w:color w:val="374151"/>
+                <w:sz w:val="18"/>
+              </w:rPr>
+              <w:t>Pencatatan Biasa: Tanpa approval limit bertingkat. Rawan pengeluaran lokal fiktif.</w:t>
+            </w:r>
+          </w:p>
+        </w:tc>
+        <w:tc>
+          <w:tcPr>
+            <w:tcW w:type="dxa" w:w="3269"/>
+            <w:vAlign w:val="center"/>
+            <w:shd w:fill="FFFFFF"/>
+            <w:tcMar>
+              <w:top w:w="90" w:type="dxa"/>
+              <w:bottom w:w="90" w:type="dxa"/>
+              <w:left w:w="120" w:type="dxa"/>
+              <w:right w:w="120" w:type="dxa"/>
+            </w:tcMar>
+            <w:tcBorders>
+              <w:top w:val="single" w:sz="4" w:space="0" w:color="E5E0D8"/>
+              <w:left w:val="none"/>
+              <w:bottom w:val="single" w:sz="4" w:space="0" w:color="E5E0D8"/>
+              <w:right w:val="none"/>
+            </w:tcBorders>
+          </w:tcPr>
+          <w:p>
+            <w:pPr>
+              <w:spacing w:before="20" w:after="20" w:line="276" w:lineRule="auto"/>
+              <w:jc w:val="left"/>
+            </w:pPr>
+            <w:r>
+              <w:rPr>
+                <w:rFonts w:ascii="Segoe UI" w:hAnsi="Segoe UI"/>
+                <w:color w:val="374151"/>
+                <w:sz w:val="18"/>
+              </w:rPr>
+              <w:t>Approval 3-Tier Otomatis: Plafon bertingkat (Store Manager -&gt; Finance -&gt; Owner) wajib unggah foto nota.</w:t>
+            </w:r>
+          </w:p>
+        </w:tc>
+      </w:tr>
+      <w:tr>
+        <w:tc>
+          <w:tcPr>
+            <w:tcW w:type="dxa" w:w="2592"/>
+            <w:vAlign w:val="center"/>
+            <w:shd w:fill="FBF9F5"/>
+            <w:tcMar>
+              <w:top w:w="90" w:type="dxa"/>
+              <w:bottom w:w="90" w:type="dxa"/>
+              <w:left w:w="120" w:type="dxa"/>
+              <w:right w:w="120" w:type="dxa"/>
+            </w:tcMar>
+            <w:tcBorders>
+              <w:top w:val="single" w:sz="4" w:space="0" w:color="E5E0D8"/>
+              <w:left w:val="none"/>
+              <w:bottom w:val="single" w:sz="4" w:space="0" w:color="E5E0D8"/>
+              <w:right w:val="none"/>
+            </w:tcBorders>
+          </w:tcPr>
+          <w:p>
+            <w:pPr>
+              <w:spacing w:before="20" w:after="20" w:line="276" w:lineRule="auto"/>
+              <w:jc w:val="left"/>
+            </w:pPr>
+            <w:r>
+              <w:rPr>
+                <w:rFonts w:ascii="Segoe UI" w:hAnsi="Segoe UI"/>
+                <w:color w:val="374151"/>
+                <w:sz w:val="18"/>
+              </w:rPr>
+              <w:t>7. Portal Investor Mitra</w:t>
+            </w:r>
+          </w:p>
+        </w:tc>
+        <w:tc>
+          <w:tcPr>
+            <w:tcW w:type="dxa" w:w="3168"/>
+            <w:vAlign w:val="center"/>
+            <w:shd w:fill="FBF9F5"/>
+            <w:tcMar>
+              <w:top w:w="90" w:type="dxa"/>
+              <w:bottom w:w="90" w:type="dxa"/>
+              <w:left w:w="120" w:type="dxa"/>
+              <w:right w:w="120" w:type="dxa"/>
+            </w:tcMar>
+            <w:tcBorders>
+              <w:top w:val="single" w:sz="4" w:space="0" w:color="E5E0D8"/>
+              <w:left w:val="none"/>
+              <w:bottom w:val="single" w:sz="4" w:space="0" w:color="E5E0D8"/>
+              <w:right w:val="none"/>
+            </w:tcBorders>
+          </w:tcPr>
+          <w:p>
+            <w:pPr>
+              <w:spacing w:before="20" w:after="20" w:line="276" w:lineRule="auto"/>
+              <w:jc w:val="left"/>
+            </w:pPr>
+            <w:r>
+              <w:rPr>
+                <w:rFonts w:ascii="Segoe UI" w:hAnsi="Segoe UI"/>
+                <w:color w:val="374151"/>
+                <w:sz w:val="18"/>
+              </w:rPr>
+              <w:t>Tidak Ada: Owner harus manual rekap dan kirim Excel setiap bulan.</w:t>
+            </w:r>
+          </w:p>
+        </w:tc>
+        <w:tc>
+          <w:tcPr>
+            <w:tcW w:type="dxa" w:w="3269"/>
+            <w:vAlign w:val="center"/>
+            <w:shd w:fill="FBF9F5"/>
+            <w:tcMar>
+              <w:top w:w="90" w:type="dxa"/>
+              <w:bottom w:w="90" w:type="dxa"/>
+              <w:left w:w="120" w:type="dxa"/>
+              <w:right w:w="120" w:type="dxa"/>
+            </w:tcMar>
+            <w:tcBorders>
+              <w:top w:val="single" w:sz="4" w:space="0" w:color="E5E0D8"/>
+              <w:left w:val="none"/>
+              <w:bottom w:val="single" w:sz="4" w:space="0" w:color="E5E0D8"/>
+              <w:right w:val="none"/>
+            </w:tcBorders>
+          </w:tcPr>
+          <w:p>
+            <w:pPr>
+              <w:spacing w:before="20" w:after="20" w:line="276" w:lineRule="auto"/>
+              <w:jc w:val="left"/>
+            </w:pPr>
+            <w:r>
+              <w:rPr>
+                <w:rFonts w:ascii="Segoe UI" w:hAnsi="Segoe UI"/>
+                <w:color w:val="374151"/>
+                <w:sz w:val="18"/>
+              </w:rPr>
+              <w:t>Portal Mitra Read-Only: Investor memantau omzet harian, HPP riil, dan bagi hasil live tanpa risiko edit data.</w:t>
+            </w:r>
+          </w:p>
+        </w:tc>
+      </w:tr>
+      <w:tr>
+        <w:tc>
+          <w:tcPr>
+            <w:tcW w:type="dxa" w:w="2592"/>
+            <w:vAlign w:val="center"/>
+            <w:shd w:fill="FFFFFF"/>
+            <w:tcMar>
+              <w:top w:w="90" w:type="dxa"/>
+              <w:bottom w:w="90" w:type="dxa"/>
+              <w:left w:w="120" w:type="dxa"/>
+              <w:right w:w="120" w:type="dxa"/>
+            </w:tcMar>
+            <w:tcBorders>
+              <w:top w:val="single" w:sz="4" w:space="0" w:color="E5E0D8"/>
+              <w:left w:val="none"/>
+              <w:bottom w:val="single" w:sz="4" w:space="0" w:color="E5E0D8"/>
+              <w:right w:val="none"/>
+            </w:tcBorders>
+          </w:tcPr>
+          <w:p>
+            <w:pPr>
+              <w:spacing w:before="20" w:after="20" w:line="276" w:lineRule="auto"/>
+              <w:jc w:val="left"/>
+            </w:pPr>
+            <w:r>
+              <w:rPr>
+                <w:rFonts w:ascii="Segoe UI" w:hAnsi="Segoe UI"/>
+                <w:color w:val="374151"/>
+                <w:sz w:val="18"/>
+              </w:rPr>
+              <w:t>8. Status Kepemilikan Sistem</w:t>
+            </w:r>
+          </w:p>
+        </w:tc>
+        <w:tc>
+          <w:tcPr>
+            <w:tcW w:type="dxa" w:w="3168"/>
+            <w:vAlign w:val="center"/>
+            <w:shd w:fill="FFFFFF"/>
+            <w:tcMar>
+              <w:top w:w="90" w:type="dxa"/>
+              <w:bottom w:w="90" w:type="dxa"/>
+              <w:left w:w="120" w:type="dxa"/>
+              <w:right w:w="120" w:type="dxa"/>
+            </w:tcMar>
+            <w:tcBorders>
+              <w:top w:val="single" w:sz="4" w:space="0" w:color="E5E0D8"/>
+              <w:left w:val="none"/>
+              <w:bottom w:val="single" w:sz="4" w:space="0" w:color="E5E0D8"/>
+              <w:right w:val="none"/>
+            </w:tcBorders>
+          </w:tcPr>
+          <w:p>
+            <w:pPr>
+              <w:spacing w:before="20" w:after="20" w:line="276" w:lineRule="auto"/>
+              <w:jc w:val="left"/>
+            </w:pPr>
+            <w:r>
+              <w:rPr>
+                <w:rFonts w:ascii="Segoe UI" w:hAnsi="Segoe UI"/>
+                <w:color w:val="374151"/>
+                <w:sz w:val="18"/>
+              </w:rPr>
+              <w:t>Sewa Selamanya: Jika stop bayar, sistem mati total. Valuasi IT perusahaan = Rp 0.</w:t>
+            </w:r>
+          </w:p>
+        </w:tc>
+        <w:tc>
+          <w:tcPr>
+            <w:tcW w:type="dxa" w:w="3269"/>
+            <w:vAlign w:val="center"/>
+            <w:shd w:fill="FFFFFF"/>
+            <w:tcMar>
+              <w:top w:w="90" w:type="dxa"/>
+              <w:bottom w:w="90" w:type="dxa"/>
+              <w:left w:w="120" w:type="dxa"/>
+              <w:right w:w="120" w:type="dxa"/>
+            </w:tcMar>
+            <w:tcBorders>
+              <w:top w:val="single" w:sz="4" w:space="0" w:color="E5E0D8"/>
+              <w:left w:val="none"/>
+              <w:bottom w:val="single" w:sz="4" w:space="0" w:color="E5E0D8"/>
+              <w:right w:val="none"/>
+            </w:tcBorders>
+          </w:tcPr>
+          <w:p>
+            <w:pPr>
+              <w:spacing w:before="20" w:after="20" w:line="276" w:lineRule="auto"/>
+              <w:jc w:val="left"/>
+            </w:pPr>
+            <w:r>
+              <w:rPr>
+                <w:rFonts w:ascii="Segoe UI" w:hAnsi="Segoe UI"/>
+                <w:color w:val="374151"/>
+                <w:sz w:val="18"/>
+              </w:rPr>
+              <w:t>100% Hak Milik Kopi Jodi: Source code dan database menjadi aset intelektual berharga perusahaan.</w:t>
+            </w:r>
+          </w:p>
+        </w:tc>
+      </w:tr>
+      <w:tr>
+        <w:tc>
+          <w:tcPr>
+            <w:tcW w:type="dxa" w:w="2592"/>
+            <w:vAlign w:val="center"/>
+            <w:shd w:fill="FBF9F5"/>
+            <w:tcMar>
+              <w:top w:w="90" w:type="dxa"/>
+              <w:bottom w:w="90" w:type="dxa"/>
+              <w:left w:w="120" w:type="dxa"/>
+              <w:right w:w="120" w:type="dxa"/>
+            </w:tcMar>
+            <w:tcBorders>
+              <w:top w:val="single" w:sz="4" w:space="0" w:color="E5E0D8"/>
+              <w:left w:val="none"/>
+              <w:bottom w:val="single" w:sz="4" w:space="0" w:color="E5E0D8"/>
+              <w:right w:val="none"/>
+            </w:tcBorders>
+          </w:tcPr>
+          <w:p>
+            <w:pPr>
+              <w:spacing w:before="20" w:after="20" w:line="276" w:lineRule="auto"/>
+              <w:jc w:val="left"/>
+            </w:pPr>
+            <w:r>
+              <w:rPr>
+                <w:rFonts w:ascii="Segoe UI" w:hAnsi="Segoe UI"/>
+                <w:color w:val="374151"/>
+                <w:sz w:val="18"/>
+              </w:rPr>
+              <w:t>9. Fleksibilitas Tambah Fitur</w:t>
+            </w:r>
+          </w:p>
+        </w:tc>
+        <w:tc>
+          <w:tcPr>
+            <w:tcW w:type="dxa" w:w="3168"/>
+            <w:vAlign w:val="center"/>
+            <w:shd w:fill="FBF9F5"/>
+            <w:tcMar>
+              <w:top w:w="90" w:type="dxa"/>
+              <w:bottom w:w="90" w:type="dxa"/>
+              <w:left w:w="120" w:type="dxa"/>
+              <w:right w:w="120" w:type="dxa"/>
+            </w:tcMar>
+            <w:tcBorders>
+              <w:top w:val="single" w:sz="4" w:space="0" w:color="E5E0D8"/>
+              <w:left w:val="none"/>
+              <w:bottom w:val="single" w:sz="4" w:space="0" w:color="E5E0D8"/>
+              <w:right w:val="none"/>
+            </w:tcBorders>
+          </w:tcPr>
+          <w:p>
+            <w:pPr>
+              <w:spacing w:before="20" w:after="20" w:line="276" w:lineRule="auto"/>
+              <w:jc w:val="left"/>
+            </w:pPr>
+            <w:r>
+              <w:rPr>
+                <w:rFonts w:ascii="Segoe UI" w:hAnsi="Segoe UI"/>
+                <w:color w:val="374151"/>
+                <w:sz w:val="18"/>
+              </w:rPr>
+              <w:t>Terkunci: Software massal retail umum; request fitur kafe tidak akan dibuatkan.</w:t>
+            </w:r>
+          </w:p>
+        </w:tc>
+        <w:tc>
+          <w:tcPr>
+            <w:tcW w:type="dxa" w:w="3269"/>
+            <w:vAlign w:val="center"/>
+            <w:shd w:fill="FBF9F5"/>
+            <w:tcMar>
+              <w:top w:w="90" w:type="dxa"/>
+              <w:bottom w:w="90" w:type="dxa"/>
+              <w:left w:w="120" w:type="dxa"/>
+              <w:right w:w="120" w:type="dxa"/>
+            </w:tcMar>
+            <w:tcBorders>
+              <w:top w:val="single" w:sz="4" w:space="0" w:color="E5E0D8"/>
+              <w:left w:val="none"/>
+              <w:bottom w:val="single" w:sz="4" w:space="0" w:color="E5E0D8"/>
+              <w:right w:val="none"/>
+            </w:tcBorders>
+          </w:tcPr>
+          <w:p>
+            <w:pPr>
+              <w:spacing w:before="20" w:after="20" w:line="276" w:lineRule="auto"/>
+              <w:jc w:val="left"/>
+            </w:pPr>
+            <w:r>
+              <w:rPr>
+                <w:rFonts w:ascii="Segoe UI" w:hAnsi="Segoe UI"/>
+                <w:color w:val="374151"/>
+                <w:sz w:val="18"/>
+              </w:rPr>
+              <w:t>Bebas 100% (Unlimited): Kopi Jodi bebas minta modul &amp; fitur baru apapun tanpa biaya tambahan.</w:t>
+            </w:r>
+          </w:p>
+        </w:tc>
+      </w:tr>
+      <w:tr>
+        <w:tc>
+          <w:tcPr>
+            <w:tcW w:type="dxa" w:w="2592"/>
+            <w:vAlign w:val="center"/>
+            <w:shd w:fill="FFFFFF"/>
+            <w:tcMar>
+              <w:top w:w="90" w:type="dxa"/>
+              <w:bottom w:w="90" w:type="dxa"/>
+              <w:left w:w="120" w:type="dxa"/>
+              <w:right w:w="120" w:type="dxa"/>
+            </w:tcMar>
+            <w:tcBorders>
+              <w:top w:val="single" w:sz="4" w:space="0" w:color="E5E0D8"/>
+              <w:left w:val="none"/>
+              <w:bottom w:val="single" w:sz="4" w:space="0" w:color="E5E0D8"/>
+              <w:right w:val="none"/>
+            </w:tcBorders>
+          </w:tcPr>
+          <w:p>
+            <w:pPr>
+              <w:spacing w:before="20" w:after="20" w:line="276" w:lineRule="auto"/>
+              <w:jc w:val="left"/>
+            </w:pPr>
+            <w:r>
+              <w:rPr>
+                <w:rFonts w:ascii="Segoe UI" w:hAnsi="Segoe UI"/>
+                <w:color w:val="374151"/>
+                <w:sz w:val="18"/>
+              </w:rPr>
+              <w:t>10. Branding &amp; Citra Usaha</w:t>
+            </w:r>
+          </w:p>
+        </w:tc>
+        <w:tc>
+          <w:tcPr>
+            <w:tcW w:type="dxa" w:w="3168"/>
+            <w:vAlign w:val="center"/>
+            <w:shd w:fill="FFFFFF"/>
+            <w:tcMar>
+              <w:top w:w="90" w:type="dxa"/>
+              <w:bottom w:w="90" w:type="dxa"/>
+              <w:left w:w="120" w:type="dxa"/>
+              <w:right w:w="120" w:type="dxa"/>
+            </w:tcMar>
+            <w:tcBorders>
+              <w:top w:val="single" w:sz="4" w:space="0" w:color="E5E0D8"/>
+              <w:left w:val="none"/>
+              <w:bottom w:val="single" w:sz="4" w:space="0" w:color="E5E0D8"/>
+              <w:right w:val="none"/>
+            </w:tcBorders>
+          </w:tcPr>
+          <w:p>
+            <w:pPr>
+              <w:spacing w:before="20" w:after="20" w:line="276" w:lineRule="auto"/>
+              <w:jc w:val="left"/>
+            </w:pPr>
+            <w:r>
+              <w:rPr>
+                <w:rFonts w:ascii="Segoe UI" w:hAnsi="Segoe UI"/>
+                <w:color w:val="374151"/>
+                <w:sz w:val="18"/>
+              </w:rPr>
+              <w:t>Citra UKM Retail Biasa: Logo vendor Moka terlihat di struk dan sistem.</w:t>
+            </w:r>
+          </w:p>
+        </w:tc>
+        <w:tc>
+          <w:tcPr>
+            <w:tcW w:type="dxa" w:w="3269"/>
+            <w:vAlign w:val="center"/>
+            <w:shd w:fill="FFFFFF"/>
+            <w:tcMar>
+              <w:top w:w="90" w:type="dxa"/>
+              <w:bottom w:w="90" w:type="dxa"/>
+              <w:left w:w="120" w:type="dxa"/>
+              <w:right w:w="120" w:type="dxa"/>
+            </w:tcMar>
+            <w:tcBorders>
+              <w:top w:val="single" w:sz="4" w:space="0" w:color="E5E0D8"/>
+              <w:left w:val="none"/>
+              <w:bottom w:val="single" w:sz="4" w:space="0" w:color="E5E0D8"/>
+              <w:right w:val="none"/>
+            </w:tcBorders>
+          </w:tcPr>
+          <w:p>
+            <w:pPr>
+              <w:spacing w:before="20" w:after="20" w:line="276" w:lineRule="auto"/>
+              <w:jc w:val="left"/>
+            </w:pPr>
+            <w:r>
+              <w:rPr>
+                <w:rFonts w:ascii="Segoe UI" w:hAnsi="Segoe UI"/>
+                <w:color w:val="374151"/>
+                <w:sz w:val="18"/>
+              </w:rPr>
+              <w:t>Citra Korporasi Modern: 100% brand Kopi Jodi di seluruh perangkat (setara Fore / Kopi Kenangan).</w:t>
             </w:r>
           </w:p>
         </w:tc>
@@ -3743,7 +5193,7 @@
           <w:color w:val="2C1810"/>
           <w:sz w:val="28"/>
         </w:rPr>
-        <w:t>4. Estimasi Biaya Layanan Pihak Ketiga (Infrastruktur)</w:t>
+        <w:t>5. Estimasi Biaya Layanan Pihak Ketiga (Infrastruktur)</w:t>
       </w:r>
     </w:p>
     <w:p>
@@ -4604,7 +6054,7 @@
           <w:color w:val="2C1810"/>
           <w:sz w:val="28"/>
         </w:rPr>
-        <w:t>5. Timeline Pengerjaan &amp; Ketentuan Pembayaran</w:t>
+        <w:t>6. Timeline Pengerjaan &amp; Ketentuan Pembayaran</w:t>
       </w:r>
     </w:p>
     <w:p>
@@ -4810,7 +6260,7 @@
           <w:color w:val="2C1810"/>
           <w:sz w:val="28"/>
         </w:rPr>
-        <w:t>6. Lembar Konfirmasi &amp; Persetujuan</w:t>
+        <w:t>7. Lembar Konfirmasi &amp; Persetujuan</w:t>
       </w:r>
     </w:p>
     <w:p>

</xml_diff>